<commit_message>
Edited the bar chart to show the enrollment growth between NW schools
</commit_message>
<xml_diff>
--- a/Spokane_GU_growth.docx
+++ b/Spokane_GU_growth.docx
@@ -2,6 +2,49 @@
 <file path=word/document.xml><?xml version="1.0" encoding="utf-8"?>
 <w:document xmlns:wpc="http://schemas.microsoft.com/office/word/2010/wordprocessingCanvas" xmlns:cx="http://schemas.microsoft.com/office/drawing/2014/chartex" xmlns:cx1="http://schemas.microsoft.com/office/drawing/2015/9/8/chartex" xmlns:cx2="http://schemas.microsoft.com/office/drawing/2015/10/21/chartex" xmlns:cx3="http://schemas.microsoft.com/office/drawing/2016/5/9/chartex" xmlns:cx4="http://schemas.microsoft.com/office/drawing/2016/5/10/chartex" xmlns:cx5="http://schemas.microsoft.com/office/drawing/2016/5/11/chartex" xmlns:cx6="http://schemas.microsoft.com/office/drawing/2016/5/12/chartex" xmlns:cx7="http://schemas.microsoft.com/office/drawing/2016/5/13/chartex" xmlns:cx8="http://schemas.microsoft.com/office/drawing/2016/5/14/chartex" xmlns:mc="http://schemas.openxmlformats.org/markup-compatibility/2006" xmlns:aink="http://schemas.microsoft.com/office/drawing/2016/ink" xmlns:am3d="http://schemas.microsoft.com/office/drawing/2017/model3d" xmlns:o="urn:schemas-microsoft-com:office:office" xmlns:oel="http://schemas.microsoft.com/office/2019/extlst" xmlns:r="http://schemas.openxmlformats.org/officeDocument/2006/relationships" xmlns:m="http://schemas.openxmlformats.org/officeDocument/2006/math" xmlns:v="urn:schemas-microsoft-com:vml" xmlns:wp14="http://schemas.microsoft.com/office/word/2010/wordprocessingDrawing" xmlns:wp="http://schemas.openxmlformats.org/drawingml/2006/wordprocessingDrawing" xmlns:w10="urn:schemas-microsoft-com:office:word" xmlns:w="http://schemas.openxmlformats.org/wordprocessingml/2006/main" xmlns:w14="http://schemas.microsoft.com/office/word/2010/wordml" xmlns:w15="http://schemas.microsoft.com/office/word/2012/wordml" xmlns:w16cex="http://schemas.microsoft.com/office/word/2018/wordml/cex" xmlns:w16cid="http://schemas.microsoft.com/office/word/2016/wordml/cid" xmlns:w16="http://schemas.microsoft.com/office/word/2018/wordml" xmlns:w16sdtdh="http://schemas.microsoft.com/office/word/2020/wordml/sdtdatahash" xmlns:w16se="http://schemas.microsoft.com/office/word/2015/wordml/symex" xmlns:wpg="http://schemas.microsoft.com/office/word/2010/wordprocessingGroup" xmlns:wpi="http://schemas.microsoft.com/office/word/2010/wordprocessingInk" xmlns:wne="http://schemas.microsoft.com/office/word/2006/wordml" xmlns:wps="http://schemas.microsoft.com/office/word/2010/wordprocessingShape" mc:Ignorable="w14 w15 w16se w16cid w16 w16cex w16sdtdh wp14">
   <w:body>
+    <w:p>
+      <w:pPr>
+        <w:rPr>
+          <w:sz w:val="20"/>
+          <w:szCs w:val="20"/>
+          <w:lang w:val="en-US"/>
+        </w:rPr>
+      </w:pPr>
+      <w:r>
+        <w:rPr>
+          <w:sz w:val="20"/>
+          <w:szCs w:val="20"/>
+          <w:lang w:val="en-US"/>
+        </w:rPr>
+        <w:t>April 17</w:t>
+      </w:r>
+      <w:r>
+        <w:rPr>
+          <w:sz w:val="20"/>
+          <w:szCs w:val="20"/>
+          <w:vertAlign w:val="superscript"/>
+          <w:lang w:val="en-US"/>
+        </w:rPr>
+        <w:t>th</w:t>
+      </w:r>
+      <w:r>
+        <w:rPr>
+          <w:sz w:val="20"/>
+          <w:szCs w:val="20"/>
+          <w:lang w:val="en-US"/>
+        </w:rPr>
+        <w:t xml:space="preserve"> </w:t>
+      </w:r>
+    </w:p>
+    <w:p>
+      <w:pPr>
+        <w:rPr>
+          <w:sz w:val="20"/>
+          <w:szCs w:val="20"/>
+          <w:lang w:val="en-US"/>
+        </w:rPr>
+      </w:pPr>
+    </w:p>
     <w:p>
       <w:pPr>
         <w:rPr>
@@ -851,6 +894,7 @@
           <w:sz w:val="20"/>
           <w:szCs w:val="20"/>
         </w:rPr>
+        <w:lastRenderedPageBreak/>
         <w:t>Downtown redevelopment has not begun (show the plan?)</w:t>
       </w:r>
     </w:p>
@@ -889,33 +933,848 @@
           <w:sz w:val="20"/>
           <w:szCs w:val="20"/>
         </w:rPr>
+        <w:t>Convention and tourism infrastructure still modest (can show pictures)</w:t>
+      </w:r>
+    </w:p>
+    <w:p>
+      <w:pPr>
+        <w:rPr>
+          <w:sz w:val="20"/>
+          <w:szCs w:val="20"/>
+        </w:rPr>
+      </w:pPr>
+      <w:r>
+        <w:rPr>
+          <w:rFonts w:eastAsia="Arial Unicode MS"/>
+          <w:sz w:val="20"/>
+          <w:szCs w:val="20"/>
+        </w:rPr>
+        <w:t>What changed: Basketball visibility → enrollment growth → campus construction</w:t>
+      </w:r>
+    </w:p>
+    <w:p>
+      <w:pPr>
+        <w:rPr>
+          <w:sz w:val="20"/>
+          <w:szCs w:val="20"/>
+        </w:rPr>
+      </w:pPr>
+    </w:p>
+    <w:p>
+      <w:pPr>
+        <w:numPr>
+          <w:ilvl w:val="0"/>
+          <w:numId w:val="28"/>
+        </w:numPr>
+        <w:rPr>
+          <w:sz w:val="20"/>
+          <w:szCs w:val="20"/>
+        </w:rPr>
+      </w:pPr>
+      <w:r>
+        <w:rPr>
+          <w:sz w:val="20"/>
+          <w:szCs w:val="20"/>
+        </w:rPr>
+        <w:t>Buildout</w:t>
+      </w:r>
+    </w:p>
+    <w:p>
+      <w:pPr>
+        <w:rPr>
+          <w:sz w:val="20"/>
+          <w:szCs w:val="20"/>
+        </w:rPr>
+      </w:pPr>
+    </w:p>
+    <w:p>
+      <w:pPr>
+        <w:rPr>
+          <w:sz w:val="20"/>
+          <w:szCs w:val="20"/>
+        </w:rPr>
+      </w:pPr>
+      <w:r>
+        <w:rPr>
+          <w:sz w:val="20"/>
+          <w:szCs w:val="20"/>
+        </w:rPr>
+        <w:t>(2005 - 2012) gonzaga became the institutional anchor</w:t>
+      </w:r>
+    </w:p>
+    <w:p>
+      <w:pPr>
+        <w:rPr>
+          <w:sz w:val="20"/>
+          <w:szCs w:val="20"/>
+        </w:rPr>
+      </w:pPr>
+      <w:r>
+        <w:rPr>
+          <w:sz w:val="20"/>
+          <w:szCs w:val="20"/>
+        </w:rPr>
+        <w:t xml:space="preserve">Gonzaga: </w:t>
+      </w:r>
+    </w:p>
+    <w:p>
+      <w:pPr>
+        <w:rPr>
+          <w:sz w:val="20"/>
+          <w:szCs w:val="20"/>
+        </w:rPr>
+      </w:pPr>
+      <w:r>
+        <w:rPr>
+          <w:sz w:val="20"/>
+          <w:szCs w:val="20"/>
+        </w:rPr>
+        <w:t>Academic and workforce expansion</w:t>
+      </w:r>
+    </w:p>
+    <w:p>
+      <w:pPr>
+        <w:rPr>
+          <w:sz w:val="20"/>
+          <w:szCs w:val="20"/>
+        </w:rPr>
+      </w:pPr>
+      <w:r>
+        <w:rPr>
+          <w:sz w:val="20"/>
+          <w:szCs w:val="20"/>
+        </w:rPr>
+        <w:t xml:space="preserve">2005: </w:t>
+      </w:r>
+    </w:p>
+    <w:p>
+      <w:pPr>
+        <w:numPr>
+          <w:ilvl w:val="0"/>
+          <w:numId w:val="55"/>
+        </w:numPr>
+        <w:rPr>
+          <w:sz w:val="20"/>
+          <w:szCs w:val="20"/>
+        </w:rPr>
+      </w:pPr>
+      <w:r>
+        <w:rPr>
+          <w:sz w:val="20"/>
+          <w:szCs w:val="20"/>
+        </w:rPr>
+        <w:t xml:space="preserve">Undergraduate Nursing program launched </w:t>
+      </w:r>
+    </w:p>
+    <w:p>
+      <w:pPr>
+        <w:rPr>
+          <w:sz w:val="20"/>
+          <w:szCs w:val="20"/>
+        </w:rPr>
+      </w:pPr>
+      <w:r>
+        <w:rPr>
+          <w:sz w:val="20"/>
+          <w:szCs w:val="20"/>
+        </w:rPr>
+        <w:t>2006:</w:t>
+      </w:r>
+    </w:p>
+    <w:p>
+      <w:pPr>
+        <w:numPr>
+          <w:ilvl w:val="0"/>
+          <w:numId w:val="53"/>
+        </w:numPr>
+        <w:rPr>
+          <w:sz w:val="20"/>
+          <w:szCs w:val="20"/>
+        </w:rPr>
+      </w:pPr>
+      <w:r>
+        <w:rPr>
+          <w:sz w:val="20"/>
+          <w:szCs w:val="20"/>
+        </w:rPr>
+        <w:t>ESPN College GameDay comes to Gonzaga</w:t>
+      </w:r>
+    </w:p>
+    <w:p>
+      <w:pPr>
+        <w:numPr>
+          <w:ilvl w:val="0"/>
+          <w:numId w:val="53"/>
+        </w:numPr>
+        <w:rPr>
+          <w:sz w:val="20"/>
+          <w:szCs w:val="20"/>
+        </w:rPr>
+      </w:pPr>
+      <w:r>
+        <w:rPr>
+          <w:sz w:val="20"/>
+          <w:szCs w:val="20"/>
+        </w:rPr>
+        <w:t>First non-football school west of Missisippi to host</w:t>
+      </w:r>
+    </w:p>
+    <w:p>
+      <w:pPr>
+        <w:rPr>
+          <w:sz w:val="20"/>
+          <w:szCs w:val="20"/>
+        </w:rPr>
+      </w:pPr>
+      <w:r>
+        <w:rPr>
+          <w:sz w:val="20"/>
+          <w:szCs w:val="20"/>
+        </w:rPr>
+        <w:t>2006:</w:t>
+      </w:r>
+    </w:p>
+    <w:p>
+      <w:pPr>
+        <w:numPr>
+          <w:ilvl w:val="0"/>
+          <w:numId w:val="10"/>
+        </w:numPr>
+        <w:rPr>
+          <w:sz w:val="20"/>
+          <w:szCs w:val="20"/>
+        </w:rPr>
+      </w:pPr>
+      <w:r>
+        <w:rPr>
+          <w:sz w:val="20"/>
+          <w:szCs w:val="20"/>
+        </w:rPr>
+        <w:t>Hughes Hall Bio and Chemistry wing</w:t>
+      </w:r>
+    </w:p>
+    <w:p>
+      <w:pPr>
+        <w:rPr>
+          <w:sz w:val="20"/>
+          <w:szCs w:val="20"/>
+        </w:rPr>
+      </w:pPr>
+      <w:r>
+        <w:rPr>
+          <w:sz w:val="20"/>
+          <w:szCs w:val="20"/>
+        </w:rPr>
+        <w:t>2007:</w:t>
+      </w:r>
+    </w:p>
+    <w:p>
+      <w:pPr>
+        <w:numPr>
+          <w:ilvl w:val="0"/>
+          <w:numId w:val="3"/>
+        </w:numPr>
+        <w:rPr>
+          <w:sz w:val="20"/>
+          <w:szCs w:val="20"/>
+        </w:rPr>
+      </w:pPr>
+      <w:r>
+        <w:rPr>
+          <w:sz w:val="20"/>
+          <w:szCs w:val="20"/>
+        </w:rPr>
+        <w:t>Kennedy Apartments</w:t>
+      </w:r>
+    </w:p>
+    <w:p>
+      <w:pPr>
+        <w:numPr>
+          <w:ilvl w:val="0"/>
+          <w:numId w:val="3"/>
+        </w:numPr>
+        <w:rPr>
+          <w:sz w:val="20"/>
+          <w:szCs w:val="20"/>
+        </w:rPr>
+      </w:pPr>
+      <w:r>
+        <w:rPr>
+          <w:sz w:val="20"/>
+          <w:szCs w:val="20"/>
+        </w:rPr>
+        <w:t>75 units, 220 students</w:t>
+      </w:r>
+    </w:p>
+    <w:p>
+      <w:pPr>
+        <w:rPr>
+          <w:sz w:val="20"/>
+          <w:szCs w:val="20"/>
+        </w:rPr>
+      </w:pPr>
+      <w:r>
+        <w:rPr>
+          <w:sz w:val="20"/>
+          <w:szCs w:val="20"/>
+        </w:rPr>
+        <w:t>2007:</w:t>
+      </w:r>
+    </w:p>
+    <w:p>
+      <w:pPr>
+        <w:numPr>
+          <w:ilvl w:val="0"/>
+          <w:numId w:val="15"/>
+        </w:numPr>
+        <w:rPr>
+          <w:sz w:val="20"/>
+          <w:szCs w:val="20"/>
+        </w:rPr>
+      </w:pPr>
+      <w:r>
+        <w:rPr>
+          <w:sz w:val="20"/>
+          <w:szCs w:val="20"/>
+        </w:rPr>
+        <w:t>Petterson Baseball Complex</w:t>
+      </w:r>
+    </w:p>
+    <w:p>
+      <w:pPr>
+        <w:numPr>
+          <w:ilvl w:val="0"/>
+          <w:numId w:val="15"/>
+        </w:numPr>
+        <w:rPr>
+          <w:sz w:val="20"/>
+          <w:szCs w:val="20"/>
+        </w:rPr>
+      </w:pPr>
+      <w:r>
+        <w:rPr>
+          <w:sz w:val="20"/>
+          <w:szCs w:val="20"/>
+        </w:rPr>
+        <w:t>$7M</w:t>
+      </w:r>
+    </w:p>
+    <w:p>
+      <w:pPr>
+        <w:rPr>
+          <w:sz w:val="20"/>
+          <w:szCs w:val="20"/>
+        </w:rPr>
+      </w:pPr>
+      <w:r>
+        <w:rPr>
+          <w:sz w:val="20"/>
+          <w:szCs w:val="20"/>
+        </w:rPr>
+        <w:t>2009:</w:t>
+      </w:r>
+    </w:p>
+    <w:p>
+      <w:pPr>
+        <w:numPr>
+          <w:ilvl w:val="0"/>
+          <w:numId w:val="32"/>
+        </w:numPr>
+        <w:rPr>
+          <w:sz w:val="20"/>
+          <w:szCs w:val="20"/>
+        </w:rPr>
+      </w:pPr>
+      <w:r>
+        <w:rPr>
+          <w:sz w:val="20"/>
+          <w:szCs w:val="20"/>
+        </w:rPr>
+        <w:t>Coughlin Hall</w:t>
+      </w:r>
+    </w:p>
+    <w:p>
+      <w:pPr>
+        <w:numPr>
+          <w:ilvl w:val="0"/>
+          <w:numId w:val="32"/>
+        </w:numPr>
+        <w:rPr>
+          <w:sz w:val="20"/>
+          <w:szCs w:val="20"/>
+        </w:rPr>
+      </w:pPr>
+      <w:r>
+        <w:rPr>
+          <w:sz w:val="20"/>
+          <w:szCs w:val="20"/>
+        </w:rPr>
+        <w:t>$16M residence hall</w:t>
+      </w:r>
+    </w:p>
+    <w:p>
+      <w:pPr>
+        <w:rPr>
+          <w:sz w:val="20"/>
+          <w:szCs w:val="20"/>
+        </w:rPr>
+      </w:pPr>
+      <w:r>
+        <w:rPr>
+          <w:sz w:val="20"/>
+          <w:szCs w:val="20"/>
+        </w:rPr>
+        <w:t>2012:</w:t>
+      </w:r>
+    </w:p>
+    <w:p>
+      <w:pPr>
+        <w:numPr>
+          <w:ilvl w:val="0"/>
+          <w:numId w:val="27"/>
+        </w:numPr>
+        <w:rPr>
+          <w:sz w:val="20"/>
+          <w:szCs w:val="20"/>
+        </w:rPr>
+      </w:pPr>
+      <w:r>
+        <w:rPr>
+          <w:sz w:val="20"/>
+          <w:szCs w:val="20"/>
+        </w:rPr>
+        <w:t>BARC retail center</w:t>
+      </w:r>
+    </w:p>
+    <w:p>
+      <w:pPr>
+        <w:numPr>
+          <w:ilvl w:val="0"/>
+          <w:numId w:val="27"/>
+        </w:numPr>
+        <w:rPr>
+          <w:sz w:val="20"/>
+          <w:szCs w:val="20"/>
+        </w:rPr>
+      </w:pPr>
+      <w:r>
+        <w:rPr>
+          <w:sz w:val="20"/>
+          <w:szCs w:val="20"/>
+        </w:rPr>
+        <w:t>$15M</w:t>
+      </w:r>
+    </w:p>
+    <w:p>
+      <w:pPr>
+        <w:numPr>
+          <w:ilvl w:val="0"/>
+          <w:numId w:val="27"/>
+        </w:numPr>
+        <w:rPr>
+          <w:sz w:val="20"/>
+          <w:szCs w:val="20"/>
+        </w:rPr>
+      </w:pPr>
+      <w:r>
+        <w:rPr>
+          <w:sz w:val="20"/>
+          <w:szCs w:val="20"/>
+        </w:rPr>
+        <w:t>650 parking spaced</w:t>
+      </w:r>
+    </w:p>
+    <w:p>
+      <w:pPr>
+        <w:rPr>
+          <w:sz w:val="20"/>
+          <w:szCs w:val="20"/>
+        </w:rPr>
+      </w:pPr>
+      <w:r>
+        <w:rPr>
+          <w:sz w:val="20"/>
+          <w:szCs w:val="20"/>
+        </w:rPr>
+        <w:t>By 2012, gonzaga:</w:t>
+      </w:r>
+    </w:p>
+    <w:p>
+      <w:pPr>
+        <w:numPr>
+          <w:ilvl w:val="0"/>
+          <w:numId w:val="51"/>
+        </w:numPr>
+        <w:rPr>
+          <w:sz w:val="20"/>
+          <w:szCs w:val="20"/>
+        </w:rPr>
+      </w:pPr>
+      <w:r>
+        <w:rPr>
+          <w:sz w:val="20"/>
+          <w:szCs w:val="20"/>
+        </w:rPr>
+        <w:t>Enrollment: 7,800+ students</w:t>
+      </w:r>
+    </w:p>
+    <w:p>
+      <w:pPr>
+        <w:numPr>
+          <w:ilvl w:val="0"/>
+          <w:numId w:val="51"/>
+        </w:numPr>
+        <w:rPr>
+          <w:sz w:val="20"/>
+          <w:szCs w:val="20"/>
+        </w:rPr>
+      </w:pPr>
+      <w:r>
+        <w:rPr>
+          <w:sz w:val="20"/>
+          <w:szCs w:val="20"/>
+        </w:rPr>
+        <w:t>Operating budget: ~$250M</w:t>
+      </w:r>
+    </w:p>
+    <w:p>
+      <w:pPr>
+        <w:numPr>
+          <w:ilvl w:val="0"/>
+          <w:numId w:val="51"/>
+        </w:numPr>
+        <w:rPr>
+          <w:sz w:val="20"/>
+          <w:szCs w:val="20"/>
+        </w:rPr>
+      </w:pPr>
+      <w:r>
+        <w:rPr>
+          <w:sz w:val="20"/>
+          <w:szCs w:val="20"/>
+        </w:rPr>
+        <w:t>Endowment: ~$148M</w:t>
+      </w:r>
+    </w:p>
+    <w:p>
+      <w:pPr>
+        <w:numPr>
+          <w:ilvl w:val="0"/>
+          <w:numId w:val="51"/>
+        </w:numPr>
+        <w:rPr>
+          <w:sz w:val="20"/>
+          <w:szCs w:val="20"/>
+        </w:rPr>
+      </w:pPr>
+      <w:r>
+        <w:rPr>
+          <w:sz w:val="20"/>
+          <w:szCs w:val="20"/>
+        </w:rPr>
+        <w:t>Employees: 1,100+</w:t>
+      </w:r>
+    </w:p>
+    <w:p>
+      <w:pPr>
+        <w:numPr>
+          <w:ilvl w:val="0"/>
+          <w:numId w:val="51"/>
+        </w:numPr>
+        <w:rPr>
+          <w:sz w:val="20"/>
+          <w:szCs w:val="20"/>
+        </w:rPr>
+      </w:pPr>
+      <w:r>
+        <w:rPr>
+          <w:sz w:val="20"/>
+          <w:szCs w:val="20"/>
+        </w:rPr>
+        <w:t>Top 5 non-government employers in Spokane County</w:t>
+      </w:r>
+    </w:p>
+    <w:p>
+      <w:pPr>
+        <w:rPr>
+          <w:sz w:val="20"/>
+          <w:szCs w:val="20"/>
+        </w:rPr>
+      </w:pPr>
+      <w:r>
+        <w:rPr>
+          <w:sz w:val="20"/>
+          <w:szCs w:val="20"/>
+        </w:rPr>
+        <w:t>Spokane: begins early downtown revitalization planning</w:t>
+      </w:r>
+    </w:p>
+    <w:p>
+      <w:pPr>
+        <w:numPr>
+          <w:ilvl w:val="0"/>
+          <w:numId w:val="40"/>
+        </w:numPr>
+        <w:rPr>
+          <w:sz w:val="20"/>
+          <w:szCs w:val="20"/>
+        </w:rPr>
+      </w:pPr>
+      <w:r>
+        <w:rPr>
+          <w:sz w:val="20"/>
+          <w:szCs w:val="20"/>
+        </w:rPr>
+        <w:t>Riverfront redevelopment planning</w:t>
+      </w:r>
+    </w:p>
+    <w:p>
+      <w:pPr>
+        <w:numPr>
+          <w:ilvl w:val="0"/>
+          <w:numId w:val="40"/>
+        </w:numPr>
+        <w:rPr>
+          <w:sz w:val="20"/>
+          <w:szCs w:val="20"/>
+        </w:rPr>
+      </w:pPr>
+      <w:r>
+        <w:rPr>
+          <w:sz w:val="20"/>
+          <w:szCs w:val="20"/>
+        </w:rPr>
+        <w:t>Early Kendall Yards redevelopment</w:t>
+      </w:r>
+    </w:p>
+    <w:p>
+      <w:pPr>
+        <w:numPr>
+          <w:ilvl w:val="0"/>
+          <w:numId w:val="40"/>
+        </w:numPr>
+        <w:rPr>
+          <w:sz w:val="20"/>
+          <w:szCs w:val="20"/>
+        </w:rPr>
+      </w:pPr>
+      <w:r>
+        <w:rPr>
+          <w:sz w:val="20"/>
+          <w:szCs w:val="20"/>
+        </w:rPr>
+        <w:t>Downtown hospitality expansion</w:t>
+      </w:r>
+    </w:p>
+    <w:p>
+      <w:pPr>
+        <w:numPr>
+          <w:ilvl w:val="0"/>
+          <w:numId w:val="40"/>
+        </w:numPr>
+        <w:rPr>
+          <w:sz w:val="20"/>
+          <w:szCs w:val="20"/>
+        </w:rPr>
+      </w:pPr>
+      <w:r>
+        <w:rPr>
+          <w:sz w:val="20"/>
+          <w:szCs w:val="20"/>
+        </w:rPr>
+        <w:t>Growing sports tourism</w:t>
+      </w:r>
+    </w:p>
+    <w:p>
+      <w:pPr>
+        <w:rPr>
+          <w:sz w:val="20"/>
+          <w:szCs w:val="20"/>
+        </w:rPr>
+      </w:pPr>
+      <w:r>
+        <w:rPr>
+          <w:sz w:val="20"/>
+          <w:szCs w:val="20"/>
+        </w:rPr>
+        <w:t>What changed:</w:t>
+      </w:r>
+    </w:p>
+    <w:p>
+      <w:pPr>
+        <w:spacing w:after="240"/>
+        <w:rPr>
+          <w:sz w:val="20"/>
+          <w:szCs w:val="20"/>
+        </w:rPr>
+      </w:pPr>
+      <w:r>
+        <w:rPr>
+          <w:sz w:val="20"/>
+          <w:szCs w:val="20"/>
+        </w:rPr>
+        <w:t>Gonzaga transformed into:</w:t>
+      </w:r>
+    </w:p>
+    <w:p>
+      <w:pPr>
+        <w:numPr>
+          <w:ilvl w:val="0"/>
+          <w:numId w:val="20"/>
+        </w:numPr>
+        <w:spacing w:before="240"/>
+        <w:rPr>
+          <w:sz w:val="20"/>
+          <w:szCs w:val="20"/>
+        </w:rPr>
+      </w:pPr>
+      <w:r>
+        <w:rPr>
+          <w:sz w:val="20"/>
+          <w:szCs w:val="20"/>
+        </w:rPr>
+        <w:t>A large employer</w:t>
+      </w:r>
+    </w:p>
+    <w:p>
+      <w:pPr>
+        <w:numPr>
+          <w:ilvl w:val="0"/>
+          <w:numId w:val="20"/>
+        </w:numPr>
+        <w:rPr>
+          <w:sz w:val="20"/>
+          <w:szCs w:val="20"/>
+        </w:rPr>
+      </w:pPr>
+      <w:r>
+        <w:rPr>
+          <w:sz w:val="20"/>
+          <w:szCs w:val="20"/>
+        </w:rPr>
+        <w:t>A destination university</w:t>
+      </w:r>
+    </w:p>
+    <w:p>
+      <w:pPr>
+        <w:numPr>
+          <w:ilvl w:val="0"/>
+          <w:numId w:val="20"/>
+        </w:numPr>
+        <w:spacing w:after="240"/>
+        <w:rPr>
+          <w:sz w:val="20"/>
+          <w:szCs w:val="20"/>
+        </w:rPr>
+      </w:pPr>
+      <w:r>
+        <w:rPr>
+          <w:sz w:val="20"/>
+          <w:szCs w:val="20"/>
+        </w:rPr>
+        <w:t>A professional workforce producer</w:t>
+      </w:r>
+      <w:r>
+        <w:rPr>
+          <w:sz w:val="20"/>
+          <w:szCs w:val="20"/>
+        </w:rPr>
+        <w:br/>
+      </w:r>
+    </w:p>
+    <w:p>
+      <w:pPr>
+        <w:spacing w:before="240" w:after="240"/>
+        <w:rPr>
+          <w:sz w:val="20"/>
+          <w:szCs w:val="20"/>
+        </w:rPr>
+      </w:pPr>
+      <w:r>
+        <w:rPr>
+          <w:sz w:val="20"/>
+          <w:szCs w:val="20"/>
+        </w:rPr>
+        <w:t>This created economic spillovers:</w:t>
+      </w:r>
+    </w:p>
+    <w:p>
+      <w:pPr>
+        <w:numPr>
+          <w:ilvl w:val="0"/>
+          <w:numId w:val="52"/>
+        </w:numPr>
+        <w:spacing w:before="240"/>
+        <w:rPr>
+          <w:sz w:val="20"/>
+          <w:szCs w:val="20"/>
+        </w:rPr>
+      </w:pPr>
+      <w:r>
+        <w:rPr>
+          <w:sz w:val="20"/>
+          <w:szCs w:val="20"/>
+        </w:rPr>
+        <w:t>student housing demand</w:t>
+      </w:r>
+    </w:p>
+    <w:p>
+      <w:pPr>
+        <w:numPr>
+          <w:ilvl w:val="0"/>
+          <w:numId w:val="52"/>
+        </w:numPr>
+        <w:rPr>
+          <w:sz w:val="20"/>
+          <w:szCs w:val="20"/>
+        </w:rPr>
+      </w:pPr>
+      <w:r>
+        <w:rPr>
+          <w:sz w:val="20"/>
+          <w:szCs w:val="20"/>
+        </w:rPr>
+        <w:t>restaurants and retail</w:t>
+      </w:r>
+    </w:p>
+    <w:p>
+      <w:pPr>
+        <w:numPr>
+          <w:ilvl w:val="0"/>
+          <w:numId w:val="52"/>
+        </w:numPr>
+        <w:rPr>
+          <w:sz w:val="20"/>
+          <w:szCs w:val="20"/>
+        </w:rPr>
+      </w:pPr>
+      <w:r>
+        <w:rPr>
+          <w:sz w:val="20"/>
+          <w:szCs w:val="20"/>
+        </w:rPr>
         <w:lastRenderedPageBreak/>
-        <w:t>Convention and tourism infrastructure still modest (can show pictures)</w:t>
-      </w:r>
-    </w:p>
-    <w:p>
-      <w:pPr>
-        <w:rPr>
-          <w:sz w:val="20"/>
-          <w:szCs w:val="20"/>
-        </w:rPr>
-      </w:pPr>
-      <w:r>
-        <w:rPr>
-          <w:rFonts w:eastAsia="Arial Unicode MS"/>
-          <w:sz w:val="20"/>
-          <w:szCs w:val="20"/>
-        </w:rPr>
-        <w:t>What changed: Basketball visibility → enrollment growth → campus construction</w:t>
-      </w:r>
-    </w:p>
-    <w:p>
-      <w:pPr>
-        <w:rPr>
-          <w:sz w:val="20"/>
-          <w:szCs w:val="20"/>
-        </w:rPr>
-      </w:pPr>
+        <w:t>local employment</w:t>
+      </w:r>
+    </w:p>
+    <w:p>
+      <w:pPr>
+        <w:numPr>
+          <w:ilvl w:val="0"/>
+          <w:numId w:val="52"/>
+        </w:numPr>
+        <w:rPr>
+          <w:sz w:val="20"/>
+          <w:szCs w:val="20"/>
+        </w:rPr>
+      </w:pPr>
+      <w:r>
+        <w:rPr>
+          <w:sz w:val="20"/>
+          <w:szCs w:val="20"/>
+        </w:rPr>
+        <w:t>visiting families and sports tourism</w:t>
+      </w:r>
     </w:p>
     <w:p>
       <w:pPr>
@@ -933,822 +1792,6 @@
           <w:sz w:val="20"/>
           <w:szCs w:val="20"/>
         </w:rPr>
-        <w:t>Buildout</w:t>
-      </w:r>
-    </w:p>
-    <w:p>
-      <w:pPr>
-        <w:rPr>
-          <w:sz w:val="20"/>
-          <w:szCs w:val="20"/>
-        </w:rPr>
-      </w:pPr>
-    </w:p>
-    <w:p>
-      <w:pPr>
-        <w:rPr>
-          <w:sz w:val="20"/>
-          <w:szCs w:val="20"/>
-        </w:rPr>
-      </w:pPr>
-      <w:r>
-        <w:rPr>
-          <w:sz w:val="20"/>
-          <w:szCs w:val="20"/>
-        </w:rPr>
-        <w:t>(2005 - 2012) gonzaga became the institutional anchor</w:t>
-      </w:r>
-    </w:p>
-    <w:p>
-      <w:pPr>
-        <w:rPr>
-          <w:sz w:val="20"/>
-          <w:szCs w:val="20"/>
-        </w:rPr>
-      </w:pPr>
-      <w:r>
-        <w:rPr>
-          <w:sz w:val="20"/>
-          <w:szCs w:val="20"/>
-        </w:rPr>
-        <w:t xml:space="preserve">Gonzaga: </w:t>
-      </w:r>
-    </w:p>
-    <w:p>
-      <w:pPr>
-        <w:rPr>
-          <w:sz w:val="20"/>
-          <w:szCs w:val="20"/>
-        </w:rPr>
-      </w:pPr>
-      <w:r>
-        <w:rPr>
-          <w:sz w:val="20"/>
-          <w:szCs w:val="20"/>
-        </w:rPr>
-        <w:t>Academic and workforce expansion</w:t>
-      </w:r>
-    </w:p>
-    <w:p>
-      <w:pPr>
-        <w:rPr>
-          <w:sz w:val="20"/>
-          <w:szCs w:val="20"/>
-        </w:rPr>
-      </w:pPr>
-      <w:r>
-        <w:rPr>
-          <w:sz w:val="20"/>
-          <w:szCs w:val="20"/>
-        </w:rPr>
-        <w:t xml:space="preserve">2005: </w:t>
-      </w:r>
-    </w:p>
-    <w:p>
-      <w:pPr>
-        <w:numPr>
-          <w:ilvl w:val="0"/>
-          <w:numId w:val="55"/>
-        </w:numPr>
-        <w:rPr>
-          <w:sz w:val="20"/>
-          <w:szCs w:val="20"/>
-        </w:rPr>
-      </w:pPr>
-      <w:r>
-        <w:rPr>
-          <w:sz w:val="20"/>
-          <w:szCs w:val="20"/>
-        </w:rPr>
-        <w:t xml:space="preserve">Undergraduate Nursing program launched </w:t>
-      </w:r>
-    </w:p>
-    <w:p>
-      <w:pPr>
-        <w:rPr>
-          <w:sz w:val="20"/>
-          <w:szCs w:val="20"/>
-        </w:rPr>
-      </w:pPr>
-      <w:r>
-        <w:rPr>
-          <w:sz w:val="20"/>
-          <w:szCs w:val="20"/>
-        </w:rPr>
-        <w:t>2006:</w:t>
-      </w:r>
-    </w:p>
-    <w:p>
-      <w:pPr>
-        <w:numPr>
-          <w:ilvl w:val="0"/>
-          <w:numId w:val="53"/>
-        </w:numPr>
-        <w:rPr>
-          <w:sz w:val="20"/>
-          <w:szCs w:val="20"/>
-        </w:rPr>
-      </w:pPr>
-      <w:r>
-        <w:rPr>
-          <w:sz w:val="20"/>
-          <w:szCs w:val="20"/>
-        </w:rPr>
-        <w:t>ESPN College GameDay comes to Gonzaga</w:t>
-      </w:r>
-    </w:p>
-    <w:p>
-      <w:pPr>
-        <w:numPr>
-          <w:ilvl w:val="0"/>
-          <w:numId w:val="53"/>
-        </w:numPr>
-        <w:rPr>
-          <w:sz w:val="20"/>
-          <w:szCs w:val="20"/>
-        </w:rPr>
-      </w:pPr>
-      <w:r>
-        <w:rPr>
-          <w:sz w:val="20"/>
-          <w:szCs w:val="20"/>
-        </w:rPr>
-        <w:t>First non-football school west of Missisippi to host</w:t>
-      </w:r>
-    </w:p>
-    <w:p>
-      <w:pPr>
-        <w:rPr>
-          <w:sz w:val="20"/>
-          <w:szCs w:val="20"/>
-        </w:rPr>
-      </w:pPr>
-      <w:r>
-        <w:rPr>
-          <w:sz w:val="20"/>
-          <w:szCs w:val="20"/>
-        </w:rPr>
-        <w:t>2006:</w:t>
-      </w:r>
-    </w:p>
-    <w:p>
-      <w:pPr>
-        <w:numPr>
-          <w:ilvl w:val="0"/>
-          <w:numId w:val="10"/>
-        </w:numPr>
-        <w:rPr>
-          <w:sz w:val="20"/>
-          <w:szCs w:val="20"/>
-        </w:rPr>
-      </w:pPr>
-      <w:r>
-        <w:rPr>
-          <w:sz w:val="20"/>
-          <w:szCs w:val="20"/>
-        </w:rPr>
-        <w:t>Hughes Hall Bio and Chemistry wing</w:t>
-      </w:r>
-    </w:p>
-    <w:p>
-      <w:pPr>
-        <w:rPr>
-          <w:sz w:val="20"/>
-          <w:szCs w:val="20"/>
-        </w:rPr>
-      </w:pPr>
-      <w:r>
-        <w:rPr>
-          <w:sz w:val="20"/>
-          <w:szCs w:val="20"/>
-        </w:rPr>
-        <w:t>2007:</w:t>
-      </w:r>
-    </w:p>
-    <w:p>
-      <w:pPr>
-        <w:numPr>
-          <w:ilvl w:val="0"/>
-          <w:numId w:val="3"/>
-        </w:numPr>
-        <w:rPr>
-          <w:sz w:val="20"/>
-          <w:szCs w:val="20"/>
-        </w:rPr>
-      </w:pPr>
-      <w:r>
-        <w:rPr>
-          <w:sz w:val="20"/>
-          <w:szCs w:val="20"/>
-        </w:rPr>
-        <w:t>Kennedy Apartments</w:t>
-      </w:r>
-    </w:p>
-    <w:p>
-      <w:pPr>
-        <w:numPr>
-          <w:ilvl w:val="0"/>
-          <w:numId w:val="3"/>
-        </w:numPr>
-        <w:rPr>
-          <w:sz w:val="20"/>
-          <w:szCs w:val="20"/>
-        </w:rPr>
-      </w:pPr>
-      <w:r>
-        <w:rPr>
-          <w:sz w:val="20"/>
-          <w:szCs w:val="20"/>
-        </w:rPr>
-        <w:t>75 units, 220 students</w:t>
-      </w:r>
-    </w:p>
-    <w:p>
-      <w:pPr>
-        <w:rPr>
-          <w:sz w:val="20"/>
-          <w:szCs w:val="20"/>
-        </w:rPr>
-      </w:pPr>
-      <w:r>
-        <w:rPr>
-          <w:sz w:val="20"/>
-          <w:szCs w:val="20"/>
-        </w:rPr>
-        <w:t>2007:</w:t>
-      </w:r>
-    </w:p>
-    <w:p>
-      <w:pPr>
-        <w:numPr>
-          <w:ilvl w:val="0"/>
-          <w:numId w:val="15"/>
-        </w:numPr>
-        <w:rPr>
-          <w:sz w:val="20"/>
-          <w:szCs w:val="20"/>
-        </w:rPr>
-      </w:pPr>
-      <w:r>
-        <w:rPr>
-          <w:sz w:val="20"/>
-          <w:szCs w:val="20"/>
-        </w:rPr>
-        <w:t>Petterson Baseball Complex</w:t>
-      </w:r>
-    </w:p>
-    <w:p>
-      <w:pPr>
-        <w:numPr>
-          <w:ilvl w:val="0"/>
-          <w:numId w:val="15"/>
-        </w:numPr>
-        <w:rPr>
-          <w:sz w:val="20"/>
-          <w:szCs w:val="20"/>
-        </w:rPr>
-      </w:pPr>
-      <w:r>
-        <w:rPr>
-          <w:sz w:val="20"/>
-          <w:szCs w:val="20"/>
-        </w:rPr>
-        <w:t>$7M</w:t>
-      </w:r>
-    </w:p>
-    <w:p>
-      <w:pPr>
-        <w:rPr>
-          <w:sz w:val="20"/>
-          <w:szCs w:val="20"/>
-        </w:rPr>
-      </w:pPr>
-      <w:r>
-        <w:rPr>
-          <w:sz w:val="20"/>
-          <w:szCs w:val="20"/>
-        </w:rPr>
-        <w:t>2009:</w:t>
-      </w:r>
-    </w:p>
-    <w:p>
-      <w:pPr>
-        <w:numPr>
-          <w:ilvl w:val="0"/>
-          <w:numId w:val="32"/>
-        </w:numPr>
-        <w:rPr>
-          <w:sz w:val="20"/>
-          <w:szCs w:val="20"/>
-        </w:rPr>
-      </w:pPr>
-      <w:r>
-        <w:rPr>
-          <w:sz w:val="20"/>
-          <w:szCs w:val="20"/>
-        </w:rPr>
-        <w:t>Coughlin Hall</w:t>
-      </w:r>
-    </w:p>
-    <w:p>
-      <w:pPr>
-        <w:numPr>
-          <w:ilvl w:val="0"/>
-          <w:numId w:val="32"/>
-        </w:numPr>
-        <w:rPr>
-          <w:sz w:val="20"/>
-          <w:szCs w:val="20"/>
-        </w:rPr>
-      </w:pPr>
-      <w:r>
-        <w:rPr>
-          <w:sz w:val="20"/>
-          <w:szCs w:val="20"/>
-        </w:rPr>
-        <w:t>$16M residence hall</w:t>
-      </w:r>
-    </w:p>
-    <w:p>
-      <w:pPr>
-        <w:rPr>
-          <w:sz w:val="20"/>
-          <w:szCs w:val="20"/>
-        </w:rPr>
-      </w:pPr>
-      <w:r>
-        <w:rPr>
-          <w:sz w:val="20"/>
-          <w:szCs w:val="20"/>
-        </w:rPr>
-        <w:t>2012:</w:t>
-      </w:r>
-    </w:p>
-    <w:p>
-      <w:pPr>
-        <w:numPr>
-          <w:ilvl w:val="0"/>
-          <w:numId w:val="27"/>
-        </w:numPr>
-        <w:rPr>
-          <w:sz w:val="20"/>
-          <w:szCs w:val="20"/>
-        </w:rPr>
-      </w:pPr>
-      <w:r>
-        <w:rPr>
-          <w:sz w:val="20"/>
-          <w:szCs w:val="20"/>
-        </w:rPr>
-        <w:t>BARC retail center</w:t>
-      </w:r>
-    </w:p>
-    <w:p>
-      <w:pPr>
-        <w:numPr>
-          <w:ilvl w:val="0"/>
-          <w:numId w:val="27"/>
-        </w:numPr>
-        <w:rPr>
-          <w:sz w:val="20"/>
-          <w:szCs w:val="20"/>
-        </w:rPr>
-      </w:pPr>
-      <w:r>
-        <w:rPr>
-          <w:sz w:val="20"/>
-          <w:szCs w:val="20"/>
-        </w:rPr>
-        <w:t>$15M</w:t>
-      </w:r>
-    </w:p>
-    <w:p>
-      <w:pPr>
-        <w:numPr>
-          <w:ilvl w:val="0"/>
-          <w:numId w:val="27"/>
-        </w:numPr>
-        <w:rPr>
-          <w:sz w:val="20"/>
-          <w:szCs w:val="20"/>
-        </w:rPr>
-      </w:pPr>
-      <w:r>
-        <w:rPr>
-          <w:sz w:val="20"/>
-          <w:szCs w:val="20"/>
-        </w:rPr>
-        <w:t>650 parking spaced</w:t>
-      </w:r>
-    </w:p>
-    <w:p>
-      <w:pPr>
-        <w:rPr>
-          <w:sz w:val="20"/>
-          <w:szCs w:val="20"/>
-        </w:rPr>
-      </w:pPr>
-      <w:r>
-        <w:rPr>
-          <w:sz w:val="20"/>
-          <w:szCs w:val="20"/>
-        </w:rPr>
-        <w:t>By 2012, gonzaga:</w:t>
-      </w:r>
-    </w:p>
-    <w:p>
-      <w:pPr>
-        <w:numPr>
-          <w:ilvl w:val="0"/>
-          <w:numId w:val="51"/>
-        </w:numPr>
-        <w:rPr>
-          <w:sz w:val="20"/>
-          <w:szCs w:val="20"/>
-        </w:rPr>
-      </w:pPr>
-      <w:r>
-        <w:rPr>
-          <w:sz w:val="20"/>
-          <w:szCs w:val="20"/>
-        </w:rPr>
-        <w:t>Enrollment: 7,800+ students</w:t>
-      </w:r>
-    </w:p>
-    <w:p>
-      <w:pPr>
-        <w:numPr>
-          <w:ilvl w:val="0"/>
-          <w:numId w:val="51"/>
-        </w:numPr>
-        <w:rPr>
-          <w:sz w:val="20"/>
-          <w:szCs w:val="20"/>
-        </w:rPr>
-      </w:pPr>
-      <w:r>
-        <w:rPr>
-          <w:sz w:val="20"/>
-          <w:szCs w:val="20"/>
-        </w:rPr>
-        <w:t>Operating budget: ~$250M</w:t>
-      </w:r>
-    </w:p>
-    <w:p>
-      <w:pPr>
-        <w:numPr>
-          <w:ilvl w:val="0"/>
-          <w:numId w:val="51"/>
-        </w:numPr>
-        <w:rPr>
-          <w:sz w:val="20"/>
-          <w:szCs w:val="20"/>
-        </w:rPr>
-      </w:pPr>
-      <w:r>
-        <w:rPr>
-          <w:sz w:val="20"/>
-          <w:szCs w:val="20"/>
-        </w:rPr>
-        <w:t>Endowment: ~$148M</w:t>
-      </w:r>
-    </w:p>
-    <w:p>
-      <w:pPr>
-        <w:numPr>
-          <w:ilvl w:val="0"/>
-          <w:numId w:val="51"/>
-        </w:numPr>
-        <w:rPr>
-          <w:sz w:val="20"/>
-          <w:szCs w:val="20"/>
-        </w:rPr>
-      </w:pPr>
-      <w:r>
-        <w:rPr>
-          <w:sz w:val="20"/>
-          <w:szCs w:val="20"/>
-        </w:rPr>
-        <w:t>Employees: 1,100+</w:t>
-      </w:r>
-    </w:p>
-    <w:p>
-      <w:pPr>
-        <w:numPr>
-          <w:ilvl w:val="0"/>
-          <w:numId w:val="51"/>
-        </w:numPr>
-        <w:rPr>
-          <w:sz w:val="20"/>
-          <w:szCs w:val="20"/>
-        </w:rPr>
-      </w:pPr>
-      <w:r>
-        <w:rPr>
-          <w:sz w:val="20"/>
-          <w:szCs w:val="20"/>
-        </w:rPr>
-        <w:t>Top 5 non-government employers in Spokane County</w:t>
-      </w:r>
-    </w:p>
-    <w:p>
-      <w:pPr>
-        <w:rPr>
-          <w:sz w:val="20"/>
-          <w:szCs w:val="20"/>
-        </w:rPr>
-      </w:pPr>
-      <w:r>
-        <w:rPr>
-          <w:sz w:val="20"/>
-          <w:szCs w:val="20"/>
-        </w:rPr>
-        <w:t>Spokane: begins early downtown revitalization planning</w:t>
-      </w:r>
-    </w:p>
-    <w:p>
-      <w:pPr>
-        <w:numPr>
-          <w:ilvl w:val="0"/>
-          <w:numId w:val="40"/>
-        </w:numPr>
-        <w:rPr>
-          <w:sz w:val="20"/>
-          <w:szCs w:val="20"/>
-        </w:rPr>
-      </w:pPr>
-      <w:r>
-        <w:rPr>
-          <w:sz w:val="20"/>
-          <w:szCs w:val="20"/>
-        </w:rPr>
-        <w:t>Riverfront redevelopment planning</w:t>
-      </w:r>
-    </w:p>
-    <w:p>
-      <w:pPr>
-        <w:numPr>
-          <w:ilvl w:val="0"/>
-          <w:numId w:val="40"/>
-        </w:numPr>
-        <w:rPr>
-          <w:sz w:val="20"/>
-          <w:szCs w:val="20"/>
-        </w:rPr>
-      </w:pPr>
-      <w:r>
-        <w:rPr>
-          <w:sz w:val="20"/>
-          <w:szCs w:val="20"/>
-        </w:rPr>
-        <w:t>Early Kendall Yards redevelopment</w:t>
-      </w:r>
-    </w:p>
-    <w:p>
-      <w:pPr>
-        <w:numPr>
-          <w:ilvl w:val="0"/>
-          <w:numId w:val="40"/>
-        </w:numPr>
-        <w:rPr>
-          <w:sz w:val="20"/>
-          <w:szCs w:val="20"/>
-        </w:rPr>
-      </w:pPr>
-      <w:r>
-        <w:rPr>
-          <w:sz w:val="20"/>
-          <w:szCs w:val="20"/>
-        </w:rPr>
-        <w:t>Downtown hospitality expansion</w:t>
-      </w:r>
-    </w:p>
-    <w:p>
-      <w:pPr>
-        <w:numPr>
-          <w:ilvl w:val="0"/>
-          <w:numId w:val="40"/>
-        </w:numPr>
-        <w:rPr>
-          <w:sz w:val="20"/>
-          <w:szCs w:val="20"/>
-        </w:rPr>
-      </w:pPr>
-      <w:r>
-        <w:rPr>
-          <w:sz w:val="20"/>
-          <w:szCs w:val="20"/>
-        </w:rPr>
-        <w:t>Growing sports tourism</w:t>
-      </w:r>
-    </w:p>
-    <w:p>
-      <w:pPr>
-        <w:rPr>
-          <w:sz w:val="20"/>
-          <w:szCs w:val="20"/>
-        </w:rPr>
-      </w:pPr>
-      <w:r>
-        <w:rPr>
-          <w:sz w:val="20"/>
-          <w:szCs w:val="20"/>
-        </w:rPr>
-        <w:t>What changed:</w:t>
-      </w:r>
-    </w:p>
-    <w:p>
-      <w:pPr>
-        <w:spacing w:after="240"/>
-        <w:rPr>
-          <w:sz w:val="20"/>
-          <w:szCs w:val="20"/>
-        </w:rPr>
-      </w:pPr>
-      <w:r>
-        <w:rPr>
-          <w:sz w:val="20"/>
-          <w:szCs w:val="20"/>
-        </w:rPr>
-        <w:t>Gonzaga transformed into:</w:t>
-      </w:r>
-    </w:p>
-    <w:p>
-      <w:pPr>
-        <w:numPr>
-          <w:ilvl w:val="0"/>
-          <w:numId w:val="20"/>
-        </w:numPr>
-        <w:spacing w:before="240"/>
-        <w:rPr>
-          <w:sz w:val="20"/>
-          <w:szCs w:val="20"/>
-        </w:rPr>
-      </w:pPr>
-      <w:r>
-        <w:rPr>
-          <w:sz w:val="20"/>
-          <w:szCs w:val="20"/>
-        </w:rPr>
-        <w:t>A large employer</w:t>
-      </w:r>
-    </w:p>
-    <w:p>
-      <w:pPr>
-        <w:numPr>
-          <w:ilvl w:val="0"/>
-          <w:numId w:val="20"/>
-        </w:numPr>
-        <w:rPr>
-          <w:sz w:val="20"/>
-          <w:szCs w:val="20"/>
-        </w:rPr>
-      </w:pPr>
-      <w:r>
-        <w:rPr>
-          <w:sz w:val="20"/>
-          <w:szCs w:val="20"/>
-        </w:rPr>
-        <w:t>A destination university</w:t>
-      </w:r>
-    </w:p>
-    <w:p>
-      <w:pPr>
-        <w:numPr>
-          <w:ilvl w:val="0"/>
-          <w:numId w:val="20"/>
-        </w:numPr>
-        <w:spacing w:after="240"/>
-        <w:rPr>
-          <w:sz w:val="20"/>
-          <w:szCs w:val="20"/>
-        </w:rPr>
-      </w:pPr>
-      <w:r>
-        <w:rPr>
-          <w:sz w:val="20"/>
-          <w:szCs w:val="20"/>
-        </w:rPr>
-        <w:t>A professional workforce producer</w:t>
-      </w:r>
-      <w:r>
-        <w:rPr>
-          <w:sz w:val="20"/>
-          <w:szCs w:val="20"/>
-        </w:rPr>
-        <w:br/>
-      </w:r>
-    </w:p>
-    <w:p>
-      <w:pPr>
-        <w:spacing w:before="240" w:after="240"/>
-        <w:rPr>
-          <w:sz w:val="20"/>
-          <w:szCs w:val="20"/>
-        </w:rPr>
-      </w:pPr>
-      <w:r>
-        <w:rPr>
-          <w:sz w:val="20"/>
-          <w:szCs w:val="20"/>
-        </w:rPr>
-        <w:t>This created economic spillovers:</w:t>
-      </w:r>
-    </w:p>
-    <w:p>
-      <w:pPr>
-        <w:numPr>
-          <w:ilvl w:val="0"/>
-          <w:numId w:val="52"/>
-        </w:numPr>
-        <w:spacing w:before="240"/>
-        <w:rPr>
-          <w:sz w:val="20"/>
-          <w:szCs w:val="20"/>
-        </w:rPr>
-      </w:pPr>
-      <w:r>
-        <w:rPr>
-          <w:sz w:val="20"/>
-          <w:szCs w:val="20"/>
-        </w:rPr>
-        <w:t>student housing demand</w:t>
-      </w:r>
-    </w:p>
-    <w:p>
-      <w:pPr>
-        <w:numPr>
-          <w:ilvl w:val="0"/>
-          <w:numId w:val="52"/>
-        </w:numPr>
-        <w:rPr>
-          <w:sz w:val="20"/>
-          <w:szCs w:val="20"/>
-        </w:rPr>
-      </w:pPr>
-      <w:r>
-        <w:rPr>
-          <w:sz w:val="20"/>
-          <w:szCs w:val="20"/>
-        </w:rPr>
-        <w:t>restaurants and retail</w:t>
-      </w:r>
-    </w:p>
-    <w:p>
-      <w:pPr>
-        <w:numPr>
-          <w:ilvl w:val="0"/>
-          <w:numId w:val="52"/>
-        </w:numPr>
-        <w:rPr>
-          <w:sz w:val="20"/>
-          <w:szCs w:val="20"/>
-        </w:rPr>
-      </w:pPr>
-      <w:r>
-        <w:rPr>
-          <w:sz w:val="20"/>
-          <w:szCs w:val="20"/>
-        </w:rPr>
-        <w:t>local employment</w:t>
-      </w:r>
-    </w:p>
-    <w:p>
-      <w:pPr>
-        <w:numPr>
-          <w:ilvl w:val="0"/>
-          <w:numId w:val="52"/>
-        </w:numPr>
-        <w:rPr>
-          <w:sz w:val="20"/>
-          <w:szCs w:val="20"/>
-        </w:rPr>
-      </w:pPr>
-      <w:r>
-        <w:rPr>
-          <w:sz w:val="20"/>
-          <w:szCs w:val="20"/>
-        </w:rPr>
-        <w:t>visiting families and sports tourism</w:t>
-      </w:r>
-    </w:p>
-    <w:p>
-      <w:pPr>
-        <w:numPr>
-          <w:ilvl w:val="0"/>
-          <w:numId w:val="28"/>
-        </w:numPr>
-        <w:rPr>
-          <w:sz w:val="20"/>
-          <w:szCs w:val="20"/>
-        </w:rPr>
-      </w:pPr>
-      <w:r>
-        <w:rPr>
-          <w:sz w:val="20"/>
-          <w:szCs w:val="20"/>
-        </w:rPr>
-        <w:lastRenderedPageBreak/>
         <w:t>Downtown parallel growth</w:t>
       </w:r>
     </w:p>
@@ -2333,14 +2376,6 @@
           <w:szCs w:val="20"/>
         </w:rPr>
       </w:pPr>
-    </w:p>
-    <w:p>
-      <w:pPr>
-        <w:rPr>
-          <w:sz w:val="20"/>
-          <w:szCs w:val="20"/>
-        </w:rPr>
-      </w:pPr>
       <w:r>
         <w:rPr>
           <w:sz w:val="20"/>
@@ -2489,6 +2524,7 @@
           <w:sz w:val="20"/>
           <w:szCs w:val="20"/>
         </w:rPr>
+        <w:lastRenderedPageBreak/>
         <w:t>Sen. Catherine Cortez Masto: First Latina member of U.S. Senate</w:t>
       </w:r>
     </w:p>
@@ -2504,7 +2540,6 @@
           <w:sz w:val="20"/>
           <w:szCs w:val="20"/>
         </w:rPr>
-        <w:lastRenderedPageBreak/>
         <w:t>Carl Maxey: Late Spokane attorney and civil rights leader</w:t>
       </w:r>
     </w:p>
@@ -3112,15 +3147,6 @@
           <w:szCs w:val="20"/>
         </w:rPr>
       </w:pPr>
-    </w:p>
-    <w:p>
-      <w:pPr>
-        <w:spacing w:before="240" w:after="220"/>
-        <w:rPr>
-          <w:sz w:val="20"/>
-          <w:szCs w:val="20"/>
-        </w:rPr>
-      </w:pPr>
       <w:r>
         <w:rPr>
           <w:sz w:val="20"/>
@@ -3774,23 +3800,23 @@
           <w:sz w:val="20"/>
           <w:szCs w:val="20"/>
         </w:rPr>
+        <w:t>2023: 95.0%</w:t>
+      </w:r>
+    </w:p>
+    <w:p>
+      <w:pPr>
+        <w:spacing w:before="240" w:after="240"/>
+        <w:rPr>
+          <w:sz w:val="20"/>
+          <w:szCs w:val="20"/>
+        </w:rPr>
+      </w:pPr>
+      <w:r>
+        <w:rPr>
+          <w:sz w:val="20"/>
+          <w:szCs w:val="20"/>
+        </w:rPr>
         <w:lastRenderedPageBreak/>
-        <w:t>2023: 95.0%</w:t>
-      </w:r>
-    </w:p>
-    <w:p>
-      <w:pPr>
-        <w:spacing w:before="240" w:after="240"/>
-        <w:rPr>
-          <w:sz w:val="20"/>
-          <w:szCs w:val="20"/>
-        </w:rPr>
-      </w:pPr>
-      <w:r>
-        <w:rPr>
-          <w:sz w:val="20"/>
-          <w:szCs w:val="20"/>
-        </w:rPr>
         <w:t xml:space="preserve">2023 employment rate: 76.8% of graduates working. </w:t>
       </w:r>
     </w:p>
@@ -4224,45 +4250,45 @@
           <w:sz w:val="20"/>
           <w:szCs w:val="20"/>
         </w:rPr>
+        <w:t>Providence</w:t>
+      </w:r>
+    </w:p>
+    <w:p>
+      <w:pPr>
+        <w:numPr>
+          <w:ilvl w:val="0"/>
+          <w:numId w:val="48"/>
+        </w:numPr>
+        <w:rPr>
+          <w:sz w:val="20"/>
+          <w:szCs w:val="20"/>
+        </w:rPr>
+      </w:pPr>
+      <w:r>
+        <w:rPr>
+          <w:sz w:val="20"/>
+          <w:szCs w:val="20"/>
+        </w:rPr>
+        <w:t>MultiCare</w:t>
+      </w:r>
+    </w:p>
+    <w:p>
+      <w:pPr>
+        <w:numPr>
+          <w:ilvl w:val="0"/>
+          <w:numId w:val="48"/>
+        </w:numPr>
+        <w:rPr>
+          <w:sz w:val="20"/>
+          <w:szCs w:val="20"/>
+        </w:rPr>
+      </w:pPr>
+      <w:r>
+        <w:rPr>
+          <w:sz w:val="20"/>
+          <w:szCs w:val="20"/>
+        </w:rPr>
         <w:lastRenderedPageBreak/>
-        <w:t>Providence</w:t>
-      </w:r>
-    </w:p>
-    <w:p>
-      <w:pPr>
-        <w:numPr>
-          <w:ilvl w:val="0"/>
-          <w:numId w:val="48"/>
-        </w:numPr>
-        <w:rPr>
-          <w:sz w:val="20"/>
-          <w:szCs w:val="20"/>
-        </w:rPr>
-      </w:pPr>
-      <w:r>
-        <w:rPr>
-          <w:sz w:val="20"/>
-          <w:szCs w:val="20"/>
-        </w:rPr>
-        <w:t>MultiCare</w:t>
-      </w:r>
-    </w:p>
-    <w:p>
-      <w:pPr>
-        <w:numPr>
-          <w:ilvl w:val="0"/>
-          <w:numId w:val="48"/>
-        </w:numPr>
-        <w:rPr>
-          <w:sz w:val="20"/>
-          <w:szCs w:val="20"/>
-        </w:rPr>
-      </w:pPr>
-      <w:r>
-        <w:rPr>
-          <w:sz w:val="20"/>
-          <w:szCs w:val="20"/>
-        </w:rPr>
         <w:t>CHAS Health</w:t>
       </w:r>
     </w:p>
@@ -4897,27 +4923,27 @@
           <w:sz w:val="20"/>
           <w:szCs w:val="20"/>
         </w:rPr>
+        <w:t>A significant share of graduates become teachers or school administrators.</w:t>
+      </w:r>
+    </w:p>
+    <w:p>
+      <w:pPr>
+        <w:numPr>
+          <w:ilvl w:val="0"/>
+          <w:numId w:val="16"/>
+        </w:numPr>
+        <w:spacing w:after="240"/>
+        <w:rPr>
+          <w:sz w:val="20"/>
+          <w:szCs w:val="20"/>
+        </w:rPr>
+      </w:pPr>
+      <w:r>
+        <w:rPr>
+          <w:sz w:val="20"/>
+          <w:szCs w:val="20"/>
+        </w:rPr>
         <w:lastRenderedPageBreak/>
-        <w:t>A significant share of graduates become teachers or school administrators.</w:t>
-      </w:r>
-    </w:p>
-    <w:p>
-      <w:pPr>
-        <w:numPr>
-          <w:ilvl w:val="0"/>
-          <w:numId w:val="16"/>
-        </w:numPr>
-        <w:spacing w:after="240"/>
-        <w:rPr>
-          <w:sz w:val="20"/>
-          <w:szCs w:val="20"/>
-        </w:rPr>
-      </w:pPr>
-      <w:r>
-        <w:rPr>
-          <w:sz w:val="20"/>
-          <w:szCs w:val="20"/>
-        </w:rPr>
         <w:t>Spokane Public Schools is a recurring top employer.</w:t>
       </w:r>
     </w:p>
@@ -5765,8 +5791,27 @@
           <w:sz w:val="20"/>
           <w:szCs w:val="20"/>
         </w:rPr>
+        <w:t>The Mockingbird Society</w:t>
+      </w:r>
+    </w:p>
+    <w:p>
+      <w:pPr>
+        <w:numPr>
+          <w:ilvl w:val="0"/>
+          <w:numId w:val="1"/>
+        </w:numPr>
+        <w:rPr>
+          <w:sz w:val="20"/>
+          <w:szCs w:val="20"/>
+        </w:rPr>
+      </w:pPr>
+      <w:r>
+        <w:rPr>
+          <w:sz w:val="20"/>
+          <w:szCs w:val="20"/>
+        </w:rPr>
         <w:lastRenderedPageBreak/>
-        <w:t>The Mockingbird Society</w:t>
+        <w:t>The Travelers Companies</w:t>
       </w:r>
     </w:p>
     <w:p>
@@ -5785,7 +5830,7 @@
           <w:sz w:val="20"/>
           <w:szCs w:val="20"/>
         </w:rPr>
-        <w:t>The Travelers Companies</w:t>
+        <w:t>U-District Therapy</w:t>
       </w:r>
     </w:p>
     <w:p>
@@ -5804,7 +5849,7 @@
           <w:sz w:val="20"/>
           <w:szCs w:val="20"/>
         </w:rPr>
-        <w:t>U-District Therapy</w:t>
+        <w:t>Union Animal Hospital</w:t>
       </w:r>
     </w:p>
     <w:p>
@@ -5823,7 +5868,7 @@
           <w:sz w:val="20"/>
           <w:szCs w:val="20"/>
         </w:rPr>
-        <w:t>Union Animal Hospital</w:t>
+        <w:t>USL Spokane</w:t>
       </w:r>
     </w:p>
     <w:p>
@@ -5842,25 +5887,6 @@
           <w:sz w:val="20"/>
           <w:szCs w:val="20"/>
         </w:rPr>
-        <w:t>USL Spokane</w:t>
-      </w:r>
-    </w:p>
-    <w:p>
-      <w:pPr>
-        <w:numPr>
-          <w:ilvl w:val="0"/>
-          <w:numId w:val="1"/>
-        </w:numPr>
-        <w:rPr>
-          <w:sz w:val="20"/>
-          <w:szCs w:val="20"/>
-        </w:rPr>
-      </w:pPr>
-      <w:r>
-        <w:rPr>
-          <w:sz w:val="20"/>
-          <w:szCs w:val="20"/>
-        </w:rPr>
         <w:t>Washington State University - Spokane</w:t>
       </w:r>
     </w:p>
@@ -6731,26 +6757,26 @@
           <w:sz w:val="20"/>
           <w:szCs w:val="20"/>
         </w:rPr>
+        <w:t>keytronic</w:t>
+      </w:r>
+    </w:p>
+    <w:p>
+      <w:pPr>
+        <w:numPr>
+          <w:ilvl w:val="0"/>
+          <w:numId w:val="19"/>
+        </w:numPr>
+        <w:rPr>
+          <w:sz w:val="20"/>
+          <w:szCs w:val="20"/>
+        </w:rPr>
+      </w:pPr>
+      <w:r>
+        <w:rPr>
+          <w:sz w:val="20"/>
+          <w:szCs w:val="20"/>
+        </w:rPr>
         <w:lastRenderedPageBreak/>
-        <w:t>keytronic</w:t>
-      </w:r>
-    </w:p>
-    <w:p>
-      <w:pPr>
-        <w:numPr>
-          <w:ilvl w:val="0"/>
-          <w:numId w:val="19"/>
-        </w:numPr>
-        <w:rPr>
-          <w:sz w:val="20"/>
-          <w:szCs w:val="20"/>
-        </w:rPr>
-      </w:pPr>
-      <w:r>
-        <w:rPr>
-          <w:sz w:val="20"/>
-          <w:szCs w:val="20"/>
-        </w:rPr>
         <w:t>mw engineers</w:t>
       </w:r>
     </w:p>
@@ -7825,7 +7851,6 @@
           <w:szCs w:val="20"/>
           <w:lang w:val="en-US"/>
         </w:rPr>
-        <w:lastRenderedPageBreak/>
         <w:t xml:space="preserve">  ┌────────────────────────────┬──────────────────┬────────────────────────┐</w:t>
       </w:r>
     </w:p>
@@ -7863,6 +7888,7 @@
           <w:szCs w:val="20"/>
           <w:lang w:val="en-US"/>
         </w:rPr>
+        <w:lastRenderedPageBreak/>
         <w:t xml:space="preserve">  │         Data Point         │      Status      │     Why It Matters     │</w:t>
       </w:r>
     </w:p>
@@ -9490,7 +9516,6 @@
           <w:szCs w:val="20"/>
           <w:lang w:val="en-US"/>
         </w:rPr>
-        <w:lastRenderedPageBreak/>
         <w:t xml:space="preserve">  ├──────────────────────────────────────────┼──────────────────────────────┤</w:t>
       </w:r>
     </w:p>
@@ -9528,6 +9553,7 @@
           <w:szCs w:val="20"/>
           <w:lang w:val="en-US"/>
         </w:rPr>
+        <w:lastRenderedPageBreak/>
         <w:t xml:space="preserve">  │ Spokane County unemployment rate over    │ Washington State ESD / BLS   │</w:t>
       </w:r>
     </w:p>
@@ -10914,7 +10940,6 @@
           <w:szCs w:val="20"/>
           <w:lang w:val="en-US"/>
         </w:rPr>
-        <w:lastRenderedPageBreak/>
         <w:t xml:space="preserve">  │ (more </w:t>
       </w:r>
       <w:proofErr w:type="gramStart"/>
@@ -10972,6 +10997,7 @@
           <w:szCs w:val="20"/>
           <w:lang w:val="en-US"/>
         </w:rPr>
+        <w:lastRenderedPageBreak/>
         <w:t xml:space="preserve">  ├────────────────┼────────────────────────────────────────────────────────┤</w:t>
       </w:r>
     </w:p>
@@ -12737,7 +12763,6 @@
           <w:szCs w:val="20"/>
           <w:lang w:val="en-US"/>
         </w:rPr>
-        <w:lastRenderedPageBreak/>
         <w:t xml:space="preserve">  strong visual</w:t>
       </w:r>
     </w:p>

</xml_diff>